<commit_message>
Every lesson carries the template's do now block; Quick Bread Lab has a no kitchen version (D105)
Five Unit 5 lessons (5.12, 5.14, 5.17, 5.18, 5.19) had their do now only inside the procedure table. Each now has the "Do now and hook" block every other lesson has, in its own words, and the table row points at it. Lesson 6.7's alternative was a no oven version that still needed a microwave; it is now the no kitchen alternative with a version for a room that has no microwave either.

Co-Authored-By: Claude Fable 5.1 <noreply@anthropic.com>
Claude-Session: https://claude.ai/code/session_01TaQLEJCtq2ruLJPqxdFc8k
</commit_message>
<xml_diff>
--- a/downloads/documents/04 Units/Unit 05 - Apparel and Textile Production and Design - Make It, Mend It, Wear It/Lesson 05.12 - Comparing the Same Item Across Stores Secondhand and Online.docx
+++ b/downloads/documents/04 Units/Unit 05 - Apparel and Textile Production and Design - Make It, Mend It, Wear It/Lesson 05.12 - Comparing the Same Item Across Stores Secondhand and Online.docx
@@ -511,11 +511,69 @@
       <w:pPr>
         <w:pStyle w:val="Heading2"/>
       </w:pPr>
-      <w:bookmarkStart w:id="27" w:name="procedure"/>
+      <w:bookmarkStart w:id="27" w:name="do-now-and-hook-time-4-min"/>
+      <w:r>
+        <w:t xml:space="preserve">Do now and hook (Time: 4 min)</w:t>
+      </w:r>
+      <w:bookmarkEnd w:id="27"/>
+    </w:p>
+    <w:p>
+      <w:pPr>
+        <w:pStyle w:val="FirstParagraph"/>
+      </w:pPr>
+      <w:r>
+        <w:t xml:space="preserve">Slide 1. On the board:</w:t>
+      </w:r>
+      <w:r>
+        <w:t xml:space="preserve"> </w:t>
+      </w:r>
+      <w:r>
+        <w:t xml:space="preserve">“</w:t>
+      </w:r>
+      <w:r>
+        <w:t xml:space="preserve">Four sweatshirts are on the table. Write what you think each one cost, A to D. Then circle the one you would buy.</w:t>
+      </w:r>
+      <w:r>
+        <w:t xml:space="preserve">”</w:t>
+      </w:r>
+    </w:p>
+    <w:p>
+      <w:pPr>
+        <w:pStyle w:val="BodyText"/>
+      </w:pPr>
+      <w:r>
+        <w:t xml:space="preserve">Ninety seconds of writing. Take three guesses out loud and write the spread on the board. This is the pre-assessment; keep the spread up, because the reveal in Step 4 comes back to it.</w:t>
+      </w:r>
+    </w:p>
+    <w:p>
+      <w:pPr>
+        <w:pStyle w:val="BodyText"/>
+      </w:pPr>
+      <w:r>
+        <w:t xml:space="preserve">Hook:</w:t>
+      </w:r>
+      <w:r>
+        <w:t xml:space="preserve"> </w:t>
+      </w:r>
+      <w:r>
+        <w:t xml:space="preserve">“</w:t>
+      </w:r>
+      <w:r>
+        <w:t xml:space="preserve">One of these cost four dollars more than another and will last three times as long. Nobody can tell me which one by looking at it from here.</w:t>
+      </w:r>
+      <w:r>
+        <w:t xml:space="preserve">”</w:t>
+      </w:r>
+    </w:p>
+    <w:p>
+      <w:pPr>
+        <w:pStyle w:val="Heading2"/>
+      </w:pPr>
+      <w:bookmarkStart w:id="28" w:name="procedure"/>
       <w:r>
         <w:t xml:space="preserve">Procedure</w:t>
       </w:r>
-      <w:bookmarkEnd w:id="27"/>
+      <w:bookmarkEnd w:id="28"/>
     </w:p>
     <w:p>
       <w:pPr>
@@ -632,37 +690,7 @@
               <w:jc w:val="left"/>
             </w:pPr>
             <w:r>
-              <w:t xml:space="preserve">Slide 1. On the board:</w:t>
-            </w:r>
-            <w:r>
-              <w:t xml:space="preserve"> </w:t>
-            </w:r>
-            <w:r>
-              <w:t xml:space="preserve">“</w:t>
-            </w:r>
-            <w:r>
-              <w:t xml:space="preserve">Four sweatshirts are on the table. Write what you think each one cost, A to D. Then circle the one you would buy.</w:t>
-            </w:r>
-            <w:r>
-              <w:t xml:space="preserve">”</w:t>
-            </w:r>
-            <w:r>
-              <w:t xml:space="preserve"> </w:t>
-            </w:r>
-            <w:r>
-              <w:t xml:space="preserve">Ninety seconds of writing, then take three guesses out loud and write the spread on the board. Hook:</w:t>
-            </w:r>
-            <w:r>
-              <w:t xml:space="preserve"> </w:t>
-            </w:r>
-            <w:r>
-              <w:t xml:space="preserve">“</w:t>
-            </w:r>
-            <w:r>
-              <w:t xml:space="preserve">One of these cost four dollars more than another and will last three times as long. Nobody can tell me which one by looking at it from here.</w:t>
-            </w:r>
-            <w:r>
-              <w:t xml:space="preserve">”</w:t>
+              <w:t xml:space="preserve">Slide 1. Run the do now and hook above.</w:t>
             </w:r>
           </w:p>
         </w:tc>
@@ -944,11 +972,11 @@
       <w:pPr>
         <w:pStyle w:val="Heading2"/>
       </w:pPr>
-      <w:bookmarkStart w:id="28" w:name="questions-to-ask"/>
+      <w:bookmarkStart w:id="29" w:name="questions-to-ask"/>
       <w:r>
         <w:t xml:space="preserve">Questions to ask</w:t>
       </w:r>
-      <w:bookmarkEnd w:id="28"/>
+      <w:bookmarkEnd w:id="29"/>
     </w:p>
     <w:p>
       <w:pPr>
@@ -1066,11 +1094,11 @@
       <w:pPr>
         <w:pStyle w:val="Heading2"/>
       </w:pPr>
-      <w:bookmarkStart w:id="29" w:name="check-for-understanding"/>
+      <w:bookmarkStart w:id="30" w:name="check-for-understanding"/>
       <w:r>
         <w:t xml:space="preserve">Check for understanding</w:t>
       </w:r>
-      <w:bookmarkEnd w:id="29"/>
+      <w:bookmarkEnd w:id="30"/>
     </w:p>
     <w:p>
       <w:pPr>
@@ -1132,11 +1160,11 @@
       <w:pPr>
         <w:pStyle w:val="Heading2"/>
       </w:pPr>
-      <w:bookmarkStart w:id="30" w:name="closure-time-3-min"/>
+      <w:bookmarkStart w:id="31" w:name="closure-time-3-min"/>
       <w:r>
         <w:t xml:space="preserve">Closure (Time: 3 min)</w:t>
       </w:r>
-      <w:bookmarkEnd w:id="30"/>
+      <w:bookmarkEnd w:id="31"/>
     </w:p>
     <w:p>
       <w:pPr>
@@ -1201,11 +1229,11 @@
       <w:pPr>
         <w:pStyle w:val="Heading2"/>
       </w:pPr>
-      <w:bookmarkStart w:id="31" w:name="differentiation-and-supports"/>
+      <w:bookmarkStart w:id="32" w:name="differentiation-and-supports"/>
       <w:r>
         <w:t xml:space="preserve">Differentiation and supports</w:t>
       </w:r>
-      <w:bookmarkEnd w:id="31"/>
+      <w:bookmarkEnd w:id="32"/>
     </w:p>
     <w:p>
       <w:pPr>
@@ -1330,11 +1358,11 @@
       <w:pPr>
         <w:pStyle w:val="Heading2"/>
       </w:pPr>
-      <w:bookmarkStart w:id="32" w:name="assessment"/>
+      <w:bookmarkStart w:id="33" w:name="assessment"/>
       <w:r>
         <w:t xml:space="preserve">Assessment</w:t>
       </w:r>
-      <w:bookmarkEnd w:id="32"/>
+      <w:bookmarkEnd w:id="33"/>
     </w:p>
     <w:tbl>
       <w:tblPr>
@@ -1584,11 +1612,11 @@
       <w:pPr>
         <w:pStyle w:val="Heading2"/>
       </w:pPr>
-      <w:bookmarkStart w:id="33" w:name="homework"/>
+      <w:bookmarkStart w:id="34" w:name="homework"/>
       <w:r>
         <w:t xml:space="preserve">Homework</w:t>
       </w:r>
-      <w:bookmarkEnd w:id="33"/>
+      <w:bookmarkEnd w:id="34"/>
     </w:p>
     <w:p>
       <w:pPr>
@@ -1602,11 +1630,11 @@
       <w:pPr>
         <w:pStyle w:val="Heading2"/>
       </w:pPr>
-      <w:bookmarkStart w:id="34" w:name="connections"/>
+      <w:bookmarkStart w:id="35" w:name="connections"/>
       <w:r>
         <w:t xml:space="preserve">Connections</w:t>
       </w:r>
-      <w:bookmarkEnd w:id="34"/>
+      <w:bookmarkEnd w:id="35"/>
     </w:p>
     <w:p>
       <w:pPr>
@@ -1632,11 +1660,11 @@
       <w:pPr>
         <w:pStyle w:val="Heading2"/>
       </w:pPr>
-      <w:bookmarkStart w:id="35" w:name="sources"/>
+      <w:bookmarkStart w:id="36" w:name="sources"/>
       <w:r>
         <w:t xml:space="preserve">Sources</w:t>
       </w:r>
-      <w:bookmarkEnd w:id="35"/>
+      <w:bookmarkEnd w:id="36"/>
     </w:p>
     <w:p>
       <w:pPr>
@@ -1771,11 +1799,11 @@
       <w:pPr>
         <w:pStyle w:val="Heading2"/>
       </w:pPr>
-      <w:bookmarkStart w:id="36" w:name="teacher-notes"/>
+      <w:bookmarkStart w:id="37" w:name="teacher-notes"/>
       <w:r>
         <w:t xml:space="preserve">Teacher notes</w:t>
       </w:r>
-      <w:bookmarkEnd w:id="36"/>
+      <w:bookmarkEnd w:id="37"/>
     </w:p>
     <w:p>
       <w:pPr>
@@ -1840,7 +1868,7 @@
     <w:sectPr>
       <w:headerReference w:type="default" r:id="rId9"/>
       <w:pgSz w:w="12240" w:h="15840"/>
-      <w:pgMar w:top="1440" w:bottom="1440" w:left="1440" w:right="1440" w:header="504"/>
+      <w:pgMar w:top="1296" w:bottom="1296" w:left="1296" w:right="1296" w:header="504"/>
     </w:sectPr>
   </w:body>
 </w:document>

</xml_diff>